<commit_message>
Complete Lab02 Movie Reviews API
</commit_message>
<xml_diff>
--- a/Lab01/LAB01-IE213.docx
+++ b/Lab01/LAB01-IE213.docx
@@ -563,12 +563,108 @@
           <w:szCs w:val="26"/>
         </w:rPr>
       </w:pPr>
+      <w:r>
+        <w:rPr>
+          <w:color w:val="auto"/>
+          <w:sz w:val="26"/>
+          <w:szCs w:val="26"/>
+        </w:rPr>
+        <w:t>Hồ Thị Minh Ngọc - 23521022</w:t>
+      </w:r>
     </w:p>
     <w:p>
       <w:pPr>
         <w:pStyle w:val="Default"/>
         <w:spacing w:line="360" w:lineRule="auto"/>
         <w:ind w:firstLine="2694"/>
+        <w:rPr>
+          <w:color w:val="auto"/>
+          <w:sz w:val="26"/>
+          <w:szCs w:val="26"/>
+        </w:rPr>
+      </w:pPr>
+    </w:p>
+    <w:p>
+      <w:pPr>
+        <w:pStyle w:val="Default"/>
+        <w:spacing w:line="360" w:lineRule="auto"/>
+        <w:rPr>
+          <w:color w:val="auto"/>
+          <w:sz w:val="26"/>
+          <w:szCs w:val="26"/>
+        </w:rPr>
+      </w:pPr>
+    </w:p>
+    <w:p>
+      <w:pPr>
+        <w:pStyle w:val="Default"/>
+        <w:spacing w:line="360" w:lineRule="auto"/>
+        <w:rPr>
+          <w:color w:val="auto"/>
+          <w:sz w:val="26"/>
+          <w:szCs w:val="26"/>
+        </w:rPr>
+      </w:pPr>
+    </w:p>
+    <w:p>
+      <w:pPr>
+        <w:pStyle w:val="Default"/>
+        <w:spacing w:line="360" w:lineRule="auto"/>
+        <w:rPr>
+          <w:color w:val="auto"/>
+          <w:sz w:val="26"/>
+          <w:szCs w:val="26"/>
+        </w:rPr>
+      </w:pPr>
+    </w:p>
+    <w:p>
+      <w:pPr>
+        <w:pStyle w:val="Default"/>
+        <w:spacing w:line="360" w:lineRule="auto"/>
+        <w:rPr>
+          <w:color w:val="auto"/>
+          <w:sz w:val="26"/>
+          <w:szCs w:val="26"/>
+        </w:rPr>
+      </w:pPr>
+    </w:p>
+    <w:p>
+      <w:pPr>
+        <w:pStyle w:val="Default"/>
+        <w:spacing w:line="360" w:lineRule="auto"/>
+        <w:rPr>
+          <w:color w:val="auto"/>
+          <w:sz w:val="26"/>
+          <w:szCs w:val="26"/>
+        </w:rPr>
+      </w:pPr>
+    </w:p>
+    <w:p>
+      <w:pPr>
+        <w:pStyle w:val="Default"/>
+        <w:spacing w:line="360" w:lineRule="auto"/>
+        <w:rPr>
+          <w:color w:val="auto"/>
+          <w:sz w:val="26"/>
+          <w:szCs w:val="26"/>
+        </w:rPr>
+      </w:pPr>
+    </w:p>
+    <w:p>
+      <w:pPr>
+        <w:pStyle w:val="Default"/>
+        <w:spacing w:line="360" w:lineRule="auto"/>
+        <w:rPr>
+          <w:color w:val="auto"/>
+          <w:sz w:val="26"/>
+          <w:szCs w:val="26"/>
+        </w:rPr>
+      </w:pPr>
+    </w:p>
+    <w:p>
+      <w:pPr>
+        <w:pStyle w:val="Default"/>
+        <w:spacing w:line="360" w:lineRule="auto"/>
         <w:rPr>
           <w:color w:val="auto"/>
           <w:sz w:val="26"/>
@@ -717,11 +813,13 @@
           <w:szCs w:val="26"/>
           <w:lang w:val="de-DE"/>
         </w:rPr>
+        <w:lastRenderedPageBreak/>
         <w:br w:type="page"/>
       </w:r>
     </w:p>
     <w:p>
       <w:pPr>
+        <w:jc w:val="center"/>
         <w:rPr>
           <w:rFonts w:ascii="Times New Roman" w:hAnsi="Times New Roman" w:cs="Times New Roman"/>
           <w:b/>

</xml_diff>